<commit_message>
adaptation V1.1 template + 1er export
</commit_message>
<xml_diff>
--- a/templates_docx/template_jinja.docx
+++ b/templates_docx/template_jinja.docx
@@ -120,7 +120,6 @@
         <w:t>{{</w:t>
       </w:r>
       <w:proofErr w:type="spellStart"/>
-      <w:proofErr w:type="gramStart"/>
       <w:r>
         <w:rPr>
           <w:lang w:val="fr-FR"/>
@@ -128,7 +127,6 @@
         <w:t>header.trigramme</w:t>
       </w:r>
       <w:proofErr w:type="spellEnd"/>
-      <w:proofErr w:type="gramEnd"/>
       <w:r>
         <w:rPr>
           <w:lang w:val="fr-FR"/>
@@ -155,7 +153,6 @@
         <w:t>{{</w:t>
       </w:r>
       <w:proofErr w:type="spellStart"/>
-      <w:proofErr w:type="gramStart"/>
       <w:r>
         <w:rPr>
           <w:lang w:val="fr-FR"/>
@@ -163,7 +160,6 @@
         <w:t>header.poste</w:t>
       </w:r>
       <w:proofErr w:type="spellEnd"/>
-      <w:proofErr w:type="gramEnd"/>
       <w:r>
         <w:rPr>
           <w:lang w:val="fr-FR"/>
@@ -185,7 +181,6 @@
         <w:t>{{</w:t>
       </w:r>
       <w:proofErr w:type="spellStart"/>
-      <w:proofErr w:type="gramStart"/>
       <w:r>
         <w:rPr>
           <w:lang w:val="fr-FR"/>
@@ -193,7 +188,6 @@
         <w:t>header.skills</w:t>
       </w:r>
       <w:proofErr w:type="spellEnd"/>
-      <w:proofErr w:type="gramEnd"/>
       <w:r>
         <w:rPr>
           <w:lang w:val="fr-FR"/>
@@ -226,7 +220,6 @@
         <w:t>{{</w:t>
       </w:r>
       <w:proofErr w:type="spellStart"/>
-      <w:proofErr w:type="gramStart"/>
       <w:r>
         <w:rPr>
           <w:lang w:val="fr-FR"/>
@@ -237,14 +230,7 @@
         <w:rPr>
           <w:lang w:val="fr-FR"/>
         </w:rPr>
-        <w:t>xp</w:t>
-      </w:r>
-      <w:proofErr w:type="gramEnd"/>
-      <w:r>
-        <w:rPr>
-          <w:lang w:val="fr-FR"/>
-        </w:rPr>
-        <w:t>_duration</w:t>
+        <w:t>xp_duration</w:t>
       </w:r>
       <w:proofErr w:type="spellEnd"/>
       <w:r>
@@ -336,7 +322,6 @@
       <w:r>
         <w:t>main_</w:t>
       </w:r>
-      <w:proofErr w:type="gramStart"/>
       <w:r>
         <w:t>skills.</w:t>
       </w:r>
@@ -344,7 +329,6 @@
         <w:t>table</w:t>
       </w:r>
       <w:proofErr w:type="spellEnd"/>
-      <w:proofErr w:type="gramEnd"/>
       <w:r>
         <w:t xml:space="preserve"> %}</w:t>
       </w:r>
@@ -380,35 +364,20 @@
             </w:r>
             <w:proofErr w:type="spellStart"/>
             <w:r>
-              <w:t>main_</w:t>
-            </w:r>
-            <w:proofErr w:type="gramStart"/>
-            <w:r>
-              <w:t>skills.</w:t>
+              <w:t>main_skills.</w:t>
             </w:r>
             <w:r>
               <w:t>table</w:t>
             </w:r>
             <w:proofErr w:type="spellEnd"/>
-            <w:proofErr w:type="gramEnd"/>
             <w:r>
-              <w:t xml:space="preserve"> </w:t>
-            </w:r>
-            <w:proofErr w:type="gramStart"/>
-            <w:r>
-              <w:t>%}{</w:t>
-            </w:r>
-            <w:proofErr w:type="gramEnd"/>
-            <w:r>
-              <w:t>{</w:t>
+              <w:t xml:space="preserve"> %}{{</w:t>
             </w:r>
             <w:proofErr w:type="spellStart"/>
-            <w:proofErr w:type="gramStart"/>
             <w:r>
               <w:t>entry.title</w:t>
             </w:r>
             <w:proofErr w:type="spellEnd"/>
-            <w:proofErr w:type="gramEnd"/>
             <w:r>
               <w:t>}}</w:t>
             </w:r>
@@ -435,7 +404,6 @@
               <w:t xml:space="preserve"> in </w:t>
             </w:r>
             <w:proofErr w:type="spellStart"/>
-            <w:proofErr w:type="gramStart"/>
             <w:r>
               <w:t>entry</w:t>
             </w:r>
@@ -446,17 +414,8 @@
               <w:t>description</w:t>
             </w:r>
             <w:proofErr w:type="spellEnd"/>
-            <w:proofErr w:type="gramEnd"/>
             <w:r>
-              <w:t xml:space="preserve"> </w:t>
-            </w:r>
-            <w:proofErr w:type="gramStart"/>
-            <w:r>
-              <w:t>%}{</w:t>
-            </w:r>
-            <w:proofErr w:type="gramEnd"/>
-            <w:r>
-              <w:t>{</w:t>
+              <w:t xml:space="preserve"> %}{{</w:t>
             </w:r>
             <w:proofErr w:type="spellStart"/>
             <w:r>
@@ -549,11 +508,7 @@
       </w:r>
       <w:proofErr w:type="spellStart"/>
       <w:r>
-        <w:t>main_</w:t>
-      </w:r>
-      <w:proofErr w:type="gramStart"/>
-      <w:r>
-        <w:t>skills</w:t>
+        <w:t>main_skills</w:t>
       </w:r>
       <w:r>
         <w:t>.</w:t>
@@ -562,7 +517,6 @@
         <w:t>bullet</w:t>
       </w:r>
       <w:proofErr w:type="spellEnd"/>
-      <w:proofErr w:type="gramEnd"/>
       <w:r>
         <w:t xml:space="preserve"> %}}</w:t>
       </w:r>
@@ -605,11 +559,7 @@
       </w:r>
       <w:proofErr w:type="spellStart"/>
       <w:r>
-        <w:t>main_</w:t>
-      </w:r>
-      <w:proofErr w:type="gramStart"/>
-      <w:r>
-        <w:t>skills</w:t>
+        <w:t>main_skills</w:t>
       </w:r>
       <w:r>
         <w:t>.</w:t>
@@ -618,7 +568,6 @@
         <w:t>bullet</w:t>
       </w:r>
       <w:proofErr w:type="spellEnd"/>
-      <w:proofErr w:type="gramEnd"/>
       <w:r>
         <w:t xml:space="preserve"> %}</w:t>
       </w:r>
@@ -631,14 +580,23 @@
         <w:t>{{</w:t>
       </w:r>
       <w:proofErr w:type="spellStart"/>
-      <w:proofErr w:type="gramStart"/>
       <w:r>
         <w:t>entry.title</w:t>
       </w:r>
       <w:proofErr w:type="spellEnd"/>
-      <w:proofErr w:type="gramEnd"/>
       <w:r>
         <w:t>}}</w:t>
+      </w:r>
+      <w:r>
+        <w:t xml:space="preserve">{%if </w:t>
+      </w:r>
+      <w:proofErr w:type="spellStart"/>
+      <w:r>
+        <w:t>entry.description</w:t>
+      </w:r>
+      <w:proofErr w:type="spellEnd"/>
+      <w:r>
+        <w:t xml:space="preserve"> %}</w:t>
       </w:r>
     </w:p>
     <w:p>
@@ -664,22 +622,12 @@
         <w:t xml:space="preserve"> </w:t>
       </w:r>
       <w:proofErr w:type="spellStart"/>
-      <w:proofErr w:type="gramStart"/>
       <w:r>
         <w:t>entry.description</w:t>
       </w:r>
       <w:proofErr w:type="spellEnd"/>
-      <w:proofErr w:type="gramEnd"/>
-      <w:r>
-        <w:t xml:space="preserve"> </w:t>
-      </w:r>
-      <w:proofErr w:type="gramStart"/>
-      <w:r>
-        <w:t>%}{</w:t>
-      </w:r>
-      <w:proofErr w:type="gramEnd"/>
-      <w:r>
-        <w:t>{bullet</w:t>
+      <w:r>
+        <w:t xml:space="preserve"> %}{{bullet</w:t>
       </w:r>
       <w:r>
         <w:t>1</w:t>
@@ -689,6 +637,27 @@
       </w:r>
       <w:r>
         <w:t>}}</w:t>
+      </w:r>
+      <w:r>
+        <w:t>{% if bullet</w:t>
+      </w:r>
+      <w:r>
+        <w:t>1</w:t>
+      </w:r>
+      <w:r>
+        <w:t>.de</w:t>
+      </w:r>
+      <w:r>
+        <w:t>s</w:t>
+      </w:r>
+      <w:r>
+        <w:t>cription</w:t>
+      </w:r>
+      <w:r>
+        <w:t xml:space="preserve"> %}</w:t>
+      </w:r>
+      <w:r>
+        <w:t> :</w:t>
       </w:r>
     </w:p>
     <w:p>
@@ -708,21 +677,7 @@
         <w:rPr>
           <w:bCs w:val="0"/>
         </w:rPr>
-        <w:t xml:space="preserve">in bullet1.description </w:t>
-      </w:r>
-      <w:proofErr w:type="gramStart"/>
-      <w:r>
-        <w:rPr>
-          <w:bCs w:val="0"/>
-        </w:rPr>
-        <w:t>%}{</w:t>
-      </w:r>
-      <w:proofErr w:type="gramEnd"/>
-      <w:r>
-        <w:rPr>
-          <w:bCs w:val="0"/>
-        </w:rPr>
-        <w:t>{bullet2.title</w:t>
+        <w:t>in bullet1.description %}{{bullet2.title</w:t>
       </w:r>
       <w:r>
         <w:rPr>
@@ -730,6 +685,18 @@
         </w:rPr>
         <w:t>}}</w:t>
       </w:r>
+      <w:r>
+        <w:rPr>
+          <w:bCs w:val="0"/>
+        </w:rPr>
+        <w:t>{% if bullet2.description %}</w:t>
+      </w:r>
+      <w:r>
+        <w:rPr>
+          <w:bCs w:val="0"/>
+        </w:rPr>
+        <w:t> :</w:t>
+      </w:r>
     </w:p>
     <w:p>
       <w:pPr>
@@ -748,32 +715,39 @@
         <w:t>2</w:t>
       </w:r>
       <w:r>
-        <w:t xml:space="preserve">.description </w:t>
-      </w:r>
-      <w:proofErr w:type="gramStart"/>
-      <w:r>
-        <w:t>%}{</w:t>
-      </w:r>
-      <w:proofErr w:type="gramEnd"/>
-      <w:r>
-        <w:t>{bullet</w:t>
+        <w:t>.description %}{{bullet</w:t>
       </w:r>
       <w:r>
         <w:t>3</w:t>
       </w:r>
       <w:r>
-        <w:t>.title</w:t>
-      </w:r>
-      <w:proofErr w:type="gramStart"/>
-      <w:r>
-        <w:t>}}</w:t>
-      </w:r>
-      <w:r>
-        <w:t>{</w:t>
-      </w:r>
-      <w:proofErr w:type="gramEnd"/>
-      <w:r>
-        <w:t>{bullet3.description}}</w:t>
+        <w:t>.title}}</w:t>
+      </w:r>
+      <w:r>
+        <w:t>{% if bullet3.description</w:t>
+      </w:r>
+      <w:r>
+        <w:t>%</w:t>
+      </w:r>
+      <w:r>
+        <w:t>}</w:t>
+      </w:r>
+      <w:r>
+        <w:t xml:space="preserve"> : </w:t>
+      </w:r>
+      <w:r>
+        <w:t>{{bullet3.description}}</w:t>
+      </w:r>
+      <w:r>
+        <w:t xml:space="preserve">{% </w:t>
+      </w:r>
+      <w:proofErr w:type="spellStart"/>
+      <w:r>
+        <w:t>endif</w:t>
+      </w:r>
+      <w:proofErr w:type="spellEnd"/>
+      <w:r>
+        <w:t xml:space="preserve"> %}</w:t>
       </w:r>
     </w:p>
     <w:p>
@@ -791,6 +765,17 @@
       <w:r>
         <w:t xml:space="preserve"> %}</w:t>
       </w:r>
+      <w:r>
+        <w:t xml:space="preserve">{% </w:t>
+      </w:r>
+      <w:proofErr w:type="spellStart"/>
+      <w:r>
+        <w:t>endif</w:t>
+      </w:r>
+      <w:proofErr w:type="spellEnd"/>
+      <w:r>
+        <w:t xml:space="preserve"> %}</w:t>
+      </w:r>
     </w:p>
     <w:p>
       <w:pPr>
@@ -807,6 +792,17 @@
       <w:r>
         <w:t xml:space="preserve"> %}</w:t>
       </w:r>
+      <w:r>
+        <w:t xml:space="preserve">{% </w:t>
+      </w:r>
+      <w:proofErr w:type="spellStart"/>
+      <w:r>
+        <w:t>endif</w:t>
+      </w:r>
+      <w:proofErr w:type="spellEnd"/>
+      <w:r>
+        <w:t xml:space="preserve"> %}</w:t>
+      </w:r>
     </w:p>
     <w:p>
       <w:pPr>
@@ -818,6 +814,17 @@
       <w:proofErr w:type="spellStart"/>
       <w:r>
         <w:t>endfor</w:t>
+      </w:r>
+      <w:proofErr w:type="spellEnd"/>
+      <w:r>
+        <w:t xml:space="preserve"> %}</w:t>
+      </w:r>
+      <w:r>
+        <w:t xml:space="preserve">{% </w:t>
+      </w:r>
+      <w:proofErr w:type="spellStart"/>
+      <w:r>
+        <w:t>endif</w:t>
       </w:r>
       <w:proofErr w:type="spellEnd"/>
       <w:r>
@@ -956,18 +963,9 @@
             </w:r>
             <w:proofErr w:type="spellEnd"/>
             <w:r>
-              <w:t xml:space="preserve"> </w:t>
-            </w:r>
-            <w:proofErr w:type="gramStart"/>
-            <w:r>
-              <w:t>%}{</w:t>
-            </w:r>
-            <w:proofErr w:type="gramEnd"/>
-            <w:r>
-              <w:t>{</w:t>
+              <w:t xml:space="preserve"> %}{{</w:t>
             </w:r>
             <w:proofErr w:type="spellStart"/>
-            <w:proofErr w:type="gramStart"/>
             <w:r>
               <w:t>entry</w:t>
             </w:r>
@@ -975,7 +973,6 @@
               <w:t>.date</w:t>
             </w:r>
             <w:proofErr w:type="spellEnd"/>
-            <w:proofErr w:type="gramEnd"/>
             <w:r>
               <w:t>}}</w:t>
             </w:r>
@@ -991,15 +988,71 @@
               <w:pStyle w:val="DCTableContent"/>
             </w:pPr>
             <w:r>
-              <w:t xml:space="preserve">{% </w:t>
+              <w:t>{</w:t>
+            </w:r>
+            <w:r>
+              <w:t>{</w:t>
             </w:r>
             <w:proofErr w:type="spellStart"/>
-            <w:proofErr w:type="gramStart"/>
+            <w:r>
+              <w:t>entry.</w:t>
+            </w:r>
+            <w:r>
+              <w:t>title</w:t>
+            </w:r>
+            <w:proofErr w:type="spellEnd"/>
+            <w:r>
+              <w:t>}</w:t>
+            </w:r>
+            <w:r>
+              <w:t>}</w:t>
+            </w:r>
+            <w:r>
+              <w:t xml:space="preserve"> – {{</w:t>
+            </w:r>
+            <w:proofErr w:type="spellStart"/>
+            <w:r>
+              <w:t>entry.school</w:t>
+            </w:r>
+            <w:proofErr w:type="spellEnd"/>
+            <w:r>
+              <w:t>}}</w:t>
+            </w:r>
+            <w:r>
+              <w:t xml:space="preserve">{% if </w:t>
+            </w:r>
+            <w:proofErr w:type="spellStart"/>
             <w:r>
               <w:t>entry.description</w:t>
             </w:r>
             <w:proofErr w:type="spellEnd"/>
-            <w:proofErr w:type="gramEnd"/>
+            <w:r>
+              <w:t xml:space="preserve"> %}</w:t>
+            </w:r>
+          </w:p>
+          <w:p>
+            <w:pPr>
+              <w:pStyle w:val="DCTableContent"/>
+            </w:pPr>
+            <w:r>
+              <w:t>{{</w:t>
+            </w:r>
+            <w:proofErr w:type="spellStart"/>
+            <w:r>
+              <w:t>entry.description</w:t>
+            </w:r>
+            <w:proofErr w:type="spellEnd"/>
+            <w:r>
+              <w:t>}}</w:t>
+            </w:r>
+            <w:r>
+              <w:t xml:space="preserve">{% </w:t>
+            </w:r>
+            <w:proofErr w:type="spellStart"/>
+            <w:r>
+              <w:t>endif</w:t>
+            </w:r>
+            <w:proofErr w:type="spellEnd"/>
             <w:r>
               <w:t xml:space="preserve"> %}</w:t>
             </w:r>
@@ -1071,6 +1124,196 @@
         <w:pStyle w:val="DCNormal"/>
       </w:pPr>
       <w:r>
+        <w:t xml:space="preserve">{%p if </w:t>
+      </w:r>
+      <w:r>
+        <w:t>certifications</w:t>
+      </w:r>
+      <w:r>
+        <w:t xml:space="preserve"> %}</w:t>
+      </w:r>
+    </w:p>
+    <w:p>
+      <w:pPr>
+        <w:pStyle w:val="DCT1Sections"/>
+        <w:rPr>
+          <w:lang w:val="fr-FR"/>
+        </w:rPr>
+      </w:pPr>
+      <w:r>
+        <w:rPr>
+          <w:lang w:val="fr-FR"/>
+        </w:rPr>
+        <w:t>Certifications</w:t>
+      </w:r>
+    </w:p>
+    <w:p>
+      <w:pPr>
+        <w:pStyle w:val="DCNormal"/>
+      </w:pPr>
+    </w:p>
+    <w:tbl>
+      <w:tblPr>
+        <w:tblW w:w="0" w:type="auto"/>
+        <w:tblLayout w:type="fixed"/>
+        <w:tblLook w:val="04A0" w:firstRow="1" w:lastRow="0" w:firstColumn="1" w:lastColumn="0" w:noHBand="0" w:noVBand="1"/>
+      </w:tblPr>
+      <w:tblGrid>
+        <w:gridCol w:w="1701"/>
+        <w:gridCol w:w="7937"/>
+      </w:tblGrid>
+      <w:tr>
+        <w:trPr>
+          <w:trHeight w:val="360"/>
+        </w:trPr>
+        <w:tc>
+          <w:tcPr>
+            <w:tcW w:w="1701" w:type="dxa"/>
+            <w:vAlign w:val="center"/>
+          </w:tcPr>
+          <w:p>
+            <w:pPr>
+              <w:pStyle w:val="DCTableYear"/>
+            </w:pPr>
+            <w:r>
+              <w:t xml:space="preserve">{% for entry in </w:t>
+            </w:r>
+            <w:r>
+              <w:t>certifications</w:t>
+            </w:r>
+            <w:r>
+              <w:t xml:space="preserve"> %}{{</w:t>
+            </w:r>
+            <w:proofErr w:type="spellStart"/>
+            <w:r>
+              <w:t>entry.date</w:t>
+            </w:r>
+            <w:proofErr w:type="spellEnd"/>
+            <w:r>
+              <w:t>}}</w:t>
+            </w:r>
+          </w:p>
+        </w:tc>
+        <w:tc>
+          <w:tcPr>
+            <w:tcW w:w="7937" w:type="dxa"/>
+            <w:vAlign w:val="center"/>
+          </w:tcPr>
+          <w:p>
+            <w:pPr>
+              <w:pStyle w:val="DCTableContent"/>
+            </w:pPr>
+            <w:r>
+              <w:t>{{</w:t>
+            </w:r>
+            <w:proofErr w:type="spellStart"/>
+            <w:r>
+              <w:t>entry.title</w:t>
+            </w:r>
+            <w:proofErr w:type="spellEnd"/>
+            <w:r>
+              <w:t xml:space="preserve">}}{% if </w:t>
+            </w:r>
+            <w:proofErr w:type="spellStart"/>
+            <w:r>
+              <w:t>entry.description</w:t>
+            </w:r>
+            <w:proofErr w:type="spellEnd"/>
+            <w:r>
+              <w:t xml:space="preserve"> %}</w:t>
+            </w:r>
+          </w:p>
+          <w:p>
+            <w:pPr>
+              <w:pStyle w:val="DCTableContent"/>
+            </w:pPr>
+            <w:r>
+              <w:t>{{</w:t>
+            </w:r>
+            <w:proofErr w:type="spellStart"/>
+            <w:r>
+              <w:t>entry.description</w:t>
+            </w:r>
+            <w:proofErr w:type="spellEnd"/>
+            <w:r>
+              <w:t xml:space="preserve">}}{% </w:t>
+            </w:r>
+            <w:proofErr w:type="spellStart"/>
+            <w:r>
+              <w:t>endif</w:t>
+            </w:r>
+            <w:proofErr w:type="spellEnd"/>
+            <w:r>
+              <w:t xml:space="preserve"> %}</w:t>
+            </w:r>
+          </w:p>
+        </w:tc>
+      </w:tr>
+      <w:tr>
+        <w:trPr>
+          <w:trHeight w:val="360"/>
+        </w:trPr>
+        <w:tc>
+          <w:tcPr>
+            <w:tcW w:w="1701" w:type="dxa"/>
+            <w:vAlign w:val="center"/>
+          </w:tcPr>
+          <w:p>
+            <w:pPr>
+              <w:pStyle w:val="DCTableYear"/>
+            </w:pPr>
+            <w:r>
+              <w:t xml:space="preserve">{% </w:t>
+            </w:r>
+            <w:proofErr w:type="spellStart"/>
+            <w:r>
+              <w:t>endfor</w:t>
+            </w:r>
+            <w:proofErr w:type="spellEnd"/>
+            <w:r>
+              <w:t xml:space="preserve"> %}</w:t>
+            </w:r>
+          </w:p>
+        </w:tc>
+        <w:tc>
+          <w:tcPr>
+            <w:tcW w:w="7937" w:type="dxa"/>
+            <w:vAlign w:val="center"/>
+          </w:tcPr>
+          <w:p>
+            <w:pPr>
+              <w:pStyle w:val="DCTableContent"/>
+            </w:pPr>
+          </w:p>
+        </w:tc>
+      </w:tr>
+    </w:tbl>
+    <w:p>
+      <w:pPr>
+        <w:pStyle w:val="DCNormal"/>
+      </w:pPr>
+      <w:r>
+        <w:t xml:space="preserve">{% </w:t>
+      </w:r>
+      <w:proofErr w:type="spellStart"/>
+      <w:r>
+        <w:t>endif</w:t>
+      </w:r>
+      <w:proofErr w:type="spellEnd"/>
+      <w:r>
+        <w:t xml:space="preserve"> %}</w:t>
+      </w:r>
+    </w:p>
+    <w:p>
+      <w:pPr>
+        <w:pStyle w:val="DCNormal"/>
+      </w:pPr>
+    </w:p>
+    <w:p>
+      <w:pPr>
+        <w:pStyle w:val="DCNormal"/>
+      </w:pPr>
+      <w:r>
         <w:t>{%</w:t>
       </w:r>
       <w:r>
@@ -1166,7 +1409,6 @@
               <w:t>{{</w:t>
             </w:r>
             <w:proofErr w:type="spellStart"/>
-            <w:proofErr w:type="gramStart"/>
             <w:r>
               <w:t>item</w:t>
             </w:r>
@@ -1174,7 +1416,6 @@
               <w:t>.company</w:t>
             </w:r>
             <w:proofErr w:type="spellEnd"/>
-            <w:proofErr w:type="gramEnd"/>
             <w:r>
               <w:t>}}</w:t>
             </w:r>
@@ -1193,7 +1434,6 @@
               <w:t>{{</w:t>
             </w:r>
             <w:proofErr w:type="spellStart"/>
-            <w:proofErr w:type="gramStart"/>
             <w:r>
               <w:t>item</w:t>
             </w:r>
@@ -1201,7 +1441,6 @@
               <w:t>.date</w:t>
             </w:r>
             <w:proofErr w:type="spellEnd"/>
-            <w:proofErr w:type="gramEnd"/>
             <w:r>
               <w:t>}}</w:t>
             </w:r>
@@ -1225,7 +1464,6 @@
               <w:t>{{</w:t>
             </w:r>
             <w:proofErr w:type="spellStart"/>
-            <w:proofErr w:type="gramStart"/>
             <w:r>
               <w:t>item</w:t>
             </w:r>
@@ -1233,7 +1471,6 @@
               <w:t>.poste</w:t>
             </w:r>
             <w:proofErr w:type="spellEnd"/>
-            <w:proofErr w:type="gramEnd"/>
             <w:r>
               <w:t>}}</w:t>
             </w:r>
@@ -1256,12 +1493,10 @@
         <w:t xml:space="preserve">{% if </w:t>
       </w:r>
       <w:proofErr w:type="spellStart"/>
-      <w:proofErr w:type="gramStart"/>
       <w:r>
         <w:t>item.context</w:t>
       </w:r>
       <w:proofErr w:type="spellEnd"/>
-      <w:proofErr w:type="gramEnd"/>
       <w:r>
         <w:t xml:space="preserve"> %}</w:t>
       </w:r>
@@ -1292,7 +1527,6 @@
         <w:t xml:space="preserve"> {{</w:t>
       </w:r>
       <w:proofErr w:type="spellStart"/>
-      <w:proofErr w:type="gramStart"/>
       <w:r>
         <w:rPr>
           <w:b/>
@@ -1306,7 +1540,6 @@
         <w:t>.context</w:t>
       </w:r>
       <w:proofErr w:type="spellEnd"/>
-      <w:proofErr w:type="gramEnd"/>
       <w:r>
         <w:rPr>
           <w:b/>
@@ -1335,18 +1568,16 @@
         <w:pStyle w:val="DCNormal"/>
       </w:pPr>
       <w:r>
-        <w:lastRenderedPageBreak/>
-        <w:t xml:space="preserve">{% for </w:t>
-      </w:r>
-      <w:r>
-        <w:t>entry</w:t>
-      </w:r>
-      <w:r>
-        <w:t xml:space="preserve"> in </w:t>
-      </w:r>
+        <w:t xml:space="preserve">{% for entry in </w:t>
+      </w:r>
+      <w:proofErr w:type="spellStart"/>
       <w:r>
         <w:t>item</w:t>
       </w:r>
+      <w:r>
+        <w:t>.description</w:t>
+      </w:r>
+      <w:proofErr w:type="spellEnd"/>
       <w:r>
         <w:t xml:space="preserve"> %}</w:t>
       </w:r>
@@ -1359,14 +1590,20 @@
         <w:t>{{</w:t>
       </w:r>
       <w:proofErr w:type="spellStart"/>
-      <w:proofErr w:type="gramStart"/>
       <w:r>
         <w:t>entry.title</w:t>
       </w:r>
       <w:proofErr w:type="spellEnd"/>
-      <w:proofErr w:type="gramEnd"/>
-      <w:r>
-        <w:t>}}</w:t>
+      <w:r>
+        <w:t xml:space="preserve">}}{%if </w:t>
+      </w:r>
+      <w:proofErr w:type="spellStart"/>
+      <w:r>
+        <w:t>entry.description</w:t>
+      </w:r>
+      <w:proofErr w:type="spellEnd"/>
+      <w:r>
+        <w:t xml:space="preserve"> %}</w:t>
       </w:r>
     </w:p>
     <w:p>
@@ -1377,22 +1614,12 @@
         <w:t xml:space="preserve">{% for bullet1 in </w:t>
       </w:r>
       <w:proofErr w:type="spellStart"/>
-      <w:proofErr w:type="gramStart"/>
       <w:r>
         <w:t>entry.description</w:t>
       </w:r>
       <w:proofErr w:type="spellEnd"/>
-      <w:proofErr w:type="gramEnd"/>
-      <w:r>
-        <w:t xml:space="preserve"> </w:t>
-      </w:r>
-      <w:proofErr w:type="gramStart"/>
-      <w:r>
-        <w:t>%}{</w:t>
-      </w:r>
-      <w:proofErr w:type="gramEnd"/>
-      <w:r>
-        <w:t>{bullet1.title}}</w:t>
+      <w:r>
+        <w:t xml:space="preserve"> %}{{bullet1.title}}{% if bullet1.description %} :</w:t>
       </w:r>
     </w:p>
     <w:p>
@@ -1406,21 +1633,7 @@
         <w:rPr>
           <w:bCs w:val="0"/>
         </w:rPr>
-        <w:t xml:space="preserve">{% for bullet2 in bullet1.description </w:t>
-      </w:r>
-      <w:proofErr w:type="gramStart"/>
-      <w:r>
-        <w:rPr>
-          <w:bCs w:val="0"/>
-        </w:rPr>
-        <w:t>%}{</w:t>
-      </w:r>
-      <w:proofErr w:type="gramEnd"/>
-      <w:r>
-        <w:rPr>
-          <w:bCs w:val="0"/>
-        </w:rPr>
-        <w:t>{bullet2.title}}</w:t>
+        <w:t>{% for bullet2 in bullet1.description %}{{bullet2.title}}{% if bullet2.description %} :</w:t>
       </w:r>
     </w:p>
     <w:p>
@@ -1440,32 +1653,24 @@
         <w:t>2</w:t>
       </w:r>
       <w:r>
-        <w:t xml:space="preserve">.description </w:t>
-      </w:r>
-      <w:proofErr w:type="gramStart"/>
-      <w:r>
-        <w:t>%}{</w:t>
-      </w:r>
-      <w:proofErr w:type="gramEnd"/>
-      <w:r>
-        <w:t>{bullet</w:t>
+        <w:t>.description %}{{bullet</w:t>
       </w:r>
       <w:r>
         <w:t>3</w:t>
       </w:r>
       <w:r>
-        <w:t>.title</w:t>
-      </w:r>
-      <w:proofErr w:type="gramStart"/>
-      <w:r>
-        <w:t>}}</w:t>
-      </w:r>
-      <w:r>
-        <w:t>{</w:t>
-      </w:r>
-      <w:proofErr w:type="gramEnd"/>
-      <w:r>
-        <w:t>{bullet3.description}}</w:t>
+        <w:t>.title}}</w:t>
+      </w:r>
+      <w:r>
+        <w:t xml:space="preserve">{% if bullet3.description%} : {{bullet3.description}}{% </w:t>
+      </w:r>
+      <w:proofErr w:type="spellStart"/>
+      <w:r>
+        <w:t>endif</w:t>
+      </w:r>
+      <w:proofErr w:type="spellEnd"/>
+      <w:r>
+        <w:t xml:space="preserve"> %}</w:t>
       </w:r>
     </w:p>
     <w:p>
@@ -1481,6 +1686,14 @@
       </w:r>
       <w:proofErr w:type="spellEnd"/>
       <w:r>
+        <w:t xml:space="preserve"> %}{% </w:t>
+      </w:r>
+      <w:proofErr w:type="spellStart"/>
+      <w:r>
+        <w:t>endif</w:t>
+      </w:r>
+      <w:proofErr w:type="spellEnd"/>
+      <w:r>
         <w:t xml:space="preserve"> %}</w:t>
       </w:r>
     </w:p>
@@ -1497,6 +1710,14 @@
       </w:r>
       <w:proofErr w:type="spellEnd"/>
       <w:r>
+        <w:t xml:space="preserve"> %}{% </w:t>
+      </w:r>
+      <w:proofErr w:type="spellStart"/>
+      <w:r>
+        <w:t>endif</w:t>
+      </w:r>
+      <w:proofErr w:type="spellEnd"/>
+      <w:r>
         <w:t xml:space="preserve"> %}</w:t>
       </w:r>
     </w:p>
@@ -1510,6 +1731,14 @@
       <w:proofErr w:type="spellStart"/>
       <w:r>
         <w:t>endfor</w:t>
+      </w:r>
+      <w:proofErr w:type="spellEnd"/>
+      <w:r>
+        <w:t xml:space="preserve"> %}{% </w:t>
+      </w:r>
+      <w:proofErr w:type="spellStart"/>
+      <w:r>
+        <w:t>endif</w:t>
       </w:r>
       <w:proofErr w:type="spellEnd"/>
       <w:r>
@@ -1599,27 +1828,13 @@
         <w:rPr>
           <w:bCs/>
         </w:rPr>
-        <w:t xml:space="preserve"> </w:t>
-      </w:r>
-      <w:proofErr w:type="gramStart"/>
+        <w:t xml:space="preserve"> %}</w:t>
+      </w:r>
       <w:r>
         <w:rPr>
           <w:bCs/>
         </w:rPr>
-        <w:t>%}</w:t>
-      </w:r>
-      <w:r>
-        <w:rPr>
-          <w:bCs/>
-        </w:rPr>
-        <w:t>{</w:t>
-      </w:r>
-      <w:proofErr w:type="gramEnd"/>
-      <w:r>
-        <w:rPr>
-          <w:bCs/>
-        </w:rPr>
-        <w:t>{</w:t>
+        <w:t>{{</w:t>
       </w:r>
       <w:proofErr w:type="spellStart"/>
       <w:r>

</xml_diff>

<commit_message>
affinage template + script de nettoyage des paragraphes bullets vides (boucles endfor défaut)
</commit_message>
<xml_diff>
--- a/templates_docx/template_jinja.docx
+++ b/templates_docx/template_jinja.docx
@@ -178,7 +178,7 @@
         <w:rPr>
           <w:lang w:val="fr-FR"/>
         </w:rPr>
-        <w:t>{{</w:t>
+        <w:t xml:space="preserve">{% if </w:t>
       </w:r>
       <w:proofErr w:type="spellStart"/>
       <w:r>
@@ -192,7 +192,101 @@
         <w:rPr>
           <w:lang w:val="fr-FR"/>
         </w:rPr>
+        <w:t xml:space="preserve"> %}{</w:t>
+      </w:r>
+      <w:r>
+        <w:rPr>
+          <w:lang w:val="fr-FR"/>
+        </w:rPr>
+        <w:t xml:space="preserve">% </w:t>
+      </w:r>
+      <w:r>
+        <w:rPr>
+          <w:lang w:val="fr-FR"/>
+        </w:rPr>
+        <w:t xml:space="preserve">for </w:t>
+      </w:r>
+      <w:proofErr w:type="spellStart"/>
+      <w:r>
+        <w:rPr>
+          <w:lang w:val="fr-FR"/>
+        </w:rPr>
+        <w:t>skill</w:t>
+      </w:r>
+      <w:proofErr w:type="spellEnd"/>
+      <w:r>
+        <w:rPr>
+          <w:lang w:val="fr-FR"/>
+        </w:rPr>
+        <w:t xml:space="preserve"> in </w:t>
+      </w:r>
+      <w:proofErr w:type="spellStart"/>
+      <w:r>
+        <w:rPr>
+          <w:lang w:val="fr-FR"/>
+        </w:rPr>
+        <w:t>header.skills</w:t>
+      </w:r>
+      <w:proofErr w:type="spellEnd"/>
+      <w:r>
+        <w:rPr>
+          <w:lang w:val="fr-FR"/>
+        </w:rPr>
+        <w:t xml:space="preserve"> %}</w:t>
+      </w:r>
+      <w:r>
+        <w:rPr>
+          <w:lang w:val="fr-FR"/>
+        </w:rPr>
+        <w:t>{{</w:t>
+      </w:r>
+      <w:proofErr w:type="spellStart"/>
+      <w:r>
+        <w:rPr>
+          <w:lang w:val="fr-FR"/>
+        </w:rPr>
+        <w:t>skill</w:t>
+      </w:r>
+      <w:proofErr w:type="spellEnd"/>
+      <w:r>
+        <w:rPr>
+          <w:lang w:val="fr-FR"/>
+        </w:rPr>
         <w:t>}}</w:t>
+      </w:r>
+      <w:r>
+        <w:rPr>
+          <w:lang w:val="fr-FR"/>
+        </w:rPr>
+        <w:t xml:space="preserve">, {% </w:t>
+      </w:r>
+      <w:proofErr w:type="spellStart"/>
+      <w:r>
+        <w:rPr>
+          <w:lang w:val="fr-FR"/>
+        </w:rPr>
+        <w:t>endfor</w:t>
+      </w:r>
+      <w:proofErr w:type="spellEnd"/>
+      <w:r>
+        <w:rPr>
+          <w:lang w:val="fr-FR"/>
+        </w:rPr>
+        <w:t xml:space="preserve"> %}{% </w:t>
+      </w:r>
+      <w:proofErr w:type="spellStart"/>
+      <w:r>
+        <w:rPr>
+          <w:lang w:val="fr-FR"/>
+        </w:rPr>
+        <w:t>endif</w:t>
+      </w:r>
+      <w:proofErr w:type="spellEnd"/>
+      <w:r>
+        <w:rPr>
+          <w:lang w:val="fr-FR"/>
+        </w:rPr>
+        <w:t xml:space="preserve"> %}</w:t>
       </w:r>
     </w:p>
     <w:p>
@@ -253,10 +347,7 @@
     </w:p>
     <w:p>
       <w:pPr>
-        <w:spacing w:after="200"/>
-        <w:rPr>
-          <w:sz w:val="20"/>
-        </w:rPr>
+        <w:pStyle w:val="DCNormal"/>
       </w:pPr>
       <w:r>
         <w:br w:type="page"/>
@@ -498,11 +589,6 @@
       <w:r>
         <w:t xml:space="preserve"> %}</w:t>
       </w:r>
-    </w:p>
-    <w:p>
-      <w:pPr>
-        <w:pStyle w:val="DCNormal"/>
-      </w:pPr>
       <w:r>
         <w:t xml:space="preserve">{% if </w:t>
       </w:r>
@@ -518,7 +604,7 @@
       </w:r>
       <w:proofErr w:type="spellEnd"/>
       <w:r>
-        <w:t xml:space="preserve"> %}}</w:t>
+        <w:t xml:space="preserve"> %}</w:t>
       </w:r>
     </w:p>
     <w:p>
@@ -830,6 +916,17 @@
       <w:r>
         <w:t xml:space="preserve"> %}</w:t>
       </w:r>
+      <w:r>
+        <w:t xml:space="preserve">{% </w:t>
+      </w:r>
+      <w:proofErr w:type="spellStart"/>
+      <w:r>
+        <w:t>endfor</w:t>
+      </w:r>
+      <w:proofErr w:type="spellEnd"/>
+      <w:r>
+        <w:t xml:space="preserve"> %}</w:t>
+      </w:r>
     </w:p>
     <w:p>
       <w:pPr>
@@ -840,7 +937,7 @@
       </w:r>
       <w:proofErr w:type="spellStart"/>
       <w:r>
-        <w:t>endfor</w:t>
+        <w:t>endif</w:t>
       </w:r>
       <w:proofErr w:type="spellEnd"/>
       <w:r>
@@ -868,42 +965,19 @@
         <w:pStyle w:val="DCNormal"/>
       </w:pPr>
       <w:r>
-        <w:t xml:space="preserve">{% </w:t>
-      </w:r>
-      <w:proofErr w:type="spellStart"/>
-      <w:r>
-        <w:t>endif</w:t>
-      </w:r>
-      <w:proofErr w:type="spellEnd"/>
-      <w:r>
-        <w:t xml:space="preserve"> %}</w:t>
-      </w:r>
-    </w:p>
-    <w:p>
-      <w:pPr>
-        <w:pStyle w:val="DCNormal"/>
-      </w:pPr>
-    </w:p>
-    <w:p>
-      <w:pPr>
-        <w:pStyle w:val="DCNormal"/>
-      </w:pPr>
-      <w:r>
         <w:t>{%</w:t>
       </w:r>
       <w:r>
         <w:t>p</w:t>
       </w:r>
       <w:r>
-        <w:t xml:space="preserve"> if </w:t>
-      </w:r>
-      <w:proofErr w:type="spellStart"/>
-      <w:r>
-        <w:t>fomations</w:t>
-      </w:r>
-      <w:proofErr w:type="spellEnd"/>
-      <w:r>
-        <w:t xml:space="preserve"> %}</w:t>
+        <w:t xml:space="preserve"> if fo</w:t>
+      </w:r>
+      <w:r>
+        <w:t>r</w:t>
+      </w:r>
+      <w:r>
+        <w:t>mations %}</w:t>
       </w:r>
     </w:p>
     <w:p>
@@ -1118,11 +1192,6 @@
       <w:pPr>
         <w:pStyle w:val="DCNormal"/>
       </w:pPr>
-    </w:p>
-    <w:p>
-      <w:pPr>
-        <w:pStyle w:val="DCNormal"/>
-      </w:pPr>
       <w:r>
         <w:t xml:space="preserve">{%p if </w:t>
       </w:r>
@@ -1362,6 +1431,7 @@
         <w:pStyle w:val="DCNormal"/>
       </w:pPr>
       <w:r>
+        <w:lastRenderedPageBreak/>
         <w:t xml:space="preserve">{% for </w:t>
       </w:r>
       <w:r>
@@ -1504,9 +1574,6 @@
     <w:p>
       <w:pPr>
         <w:pStyle w:val="DCNormal"/>
-        <w:rPr>
-          <w:b/>
-        </w:rPr>
       </w:pPr>
       <w:r>
         <w:rPr>
@@ -1546,17 +1613,12 @@
         </w:rPr>
         <w:t>}}</w:t>
       </w:r>
-    </w:p>
-    <w:p>
-      <w:pPr>
-        <w:pStyle w:val="DCNormal"/>
-      </w:pPr>
-      <w:r>
-        <w:t xml:space="preserve">{% </w:t>
+      <w:r>
+        <w:t>{% e</w:t>
       </w:r>
       <w:proofErr w:type="spellStart"/>
       <w:r>
-        <w:t>endif</w:t>
+        <w:t>ndif</w:t>
       </w:r>
       <w:proofErr w:type="spellEnd"/>
       <w:r>
@@ -1744,11 +1806,6 @@
       <w:r>
         <w:t xml:space="preserve"> %}</w:t>
       </w:r>
-    </w:p>
-    <w:p>
-      <w:pPr>
-        <w:pStyle w:val="DCNormal"/>
-      </w:pPr>
       <w:r>
         <w:t xml:space="preserve">{% </w:t>
       </w:r>

</xml_diff>

<commit_message>
fix template main skills
</commit_message>
<xml_diff>
--- a/templates_docx/template_jinja.docx
+++ b/templates_docx/template_jinja.docx
@@ -411,13 +411,335 @@
       </w:r>
       <w:proofErr w:type="spellStart"/>
       <w:r>
-        <w:t>main_</w:t>
-      </w:r>
-      <w:r>
-        <w:t>skills.</w:t>
-      </w:r>
-      <w:r>
-        <w:t>table</w:t>
+        <w:t>main_skills</w:t>
+      </w:r>
+      <w:r>
+        <w:t>.</w:t>
+      </w:r>
+      <w:r>
+        <w:t>bullet</w:t>
+      </w:r>
+      <w:proofErr w:type="spellEnd"/>
+      <w:r>
+        <w:t xml:space="preserve"> %}</w:t>
+      </w:r>
+    </w:p>
+    <w:p>
+      <w:pPr>
+        <w:pStyle w:val="DCNormal"/>
+      </w:pPr>
+      <w:r>
+        <w:t xml:space="preserve">{% for </w:t>
+      </w:r>
+      <w:r>
+        <w:t xml:space="preserve">entry in </w:t>
+      </w:r>
+      <w:proofErr w:type="spellStart"/>
+      <w:r>
+        <w:t>main_skills</w:t>
+      </w:r>
+      <w:r>
+        <w:t>.</w:t>
+      </w:r>
+      <w:r>
+        <w:t>bullet</w:t>
+      </w:r>
+      <w:proofErr w:type="spellEnd"/>
+      <w:r>
+        <w:t xml:space="preserve"> %}</w:t>
+      </w:r>
+    </w:p>
+    <w:p>
+      <w:pPr>
+        <w:pStyle w:val="DC1stbullet"/>
+      </w:pPr>
+      <w:r>
+        <w:t>{{</w:t>
+      </w:r>
+      <w:proofErr w:type="spellStart"/>
+      <w:r>
+        <w:t>entry.title</w:t>
+      </w:r>
+      <w:proofErr w:type="spellEnd"/>
+      <w:r>
+        <w:t>}}</w:t>
+      </w:r>
+      <w:r>
+        <w:t xml:space="preserve">{%if </w:t>
+      </w:r>
+      <w:proofErr w:type="spellStart"/>
+      <w:r>
+        <w:t>entry.description</w:t>
+      </w:r>
+      <w:proofErr w:type="spellEnd"/>
+      <w:r>
+        <w:t xml:space="preserve"> %}</w:t>
+      </w:r>
+    </w:p>
+    <w:p>
+      <w:pPr>
+        <w:pStyle w:val="DC2ndbullet"/>
+      </w:pPr>
+      <w:r>
+        <w:t>{</w:t>
+      </w:r>
+      <w:r>
+        <w:t xml:space="preserve">% </w:t>
+      </w:r>
+      <w:r>
+        <w:t>for bullet</w:t>
+      </w:r>
+      <w:r>
+        <w:t>1</w:t>
+      </w:r>
+      <w:r>
+        <w:t xml:space="preserve"> in</w:t>
+      </w:r>
+      <w:r>
+        <w:t xml:space="preserve"> </w:t>
+      </w:r>
+      <w:proofErr w:type="spellStart"/>
+      <w:r>
+        <w:t>entry.description</w:t>
+      </w:r>
+      <w:proofErr w:type="spellEnd"/>
+      <w:r>
+        <w:t xml:space="preserve"> %}{{bullet</w:t>
+      </w:r>
+      <w:r>
+        <w:t>1</w:t>
+      </w:r>
+      <w:r>
+        <w:t>.title</w:t>
+      </w:r>
+      <w:r>
+        <w:t>}}</w:t>
+      </w:r>
+      <w:r>
+        <w:t>{% if bullet</w:t>
+      </w:r>
+      <w:r>
+        <w:t>1</w:t>
+      </w:r>
+      <w:r>
+        <w:t>.de</w:t>
+      </w:r>
+      <w:r>
+        <w:t>s</w:t>
+      </w:r>
+      <w:r>
+        <w:t>cription</w:t>
+      </w:r>
+      <w:r>
+        <w:t xml:space="preserve"> %}</w:t>
+      </w:r>
+      <w:r>
+        <w:t> :</w:t>
+      </w:r>
+    </w:p>
+    <w:p>
+      <w:pPr>
+        <w:pStyle w:val="DC3rdbullet"/>
+        <w:rPr>
+          <w:bCs w:val="0"/>
+        </w:rPr>
+      </w:pPr>
+      <w:r>
+        <w:rPr>
+          <w:bCs w:val="0"/>
+        </w:rPr>
+        <w:t xml:space="preserve">{% for bullet2 </w:t>
+      </w:r>
+      <w:r>
+        <w:rPr>
+          <w:bCs w:val="0"/>
+        </w:rPr>
+        <w:t>in bullet1.description %}{{bullet2.title</w:t>
+      </w:r>
+      <w:r>
+        <w:rPr>
+          <w:bCs w:val="0"/>
+        </w:rPr>
+        <w:t>}}</w:t>
+      </w:r>
+      <w:r>
+        <w:rPr>
+          <w:bCs w:val="0"/>
+        </w:rPr>
+        <w:t>{% if bullet2.description %}</w:t>
+      </w:r>
+      <w:r>
+        <w:rPr>
+          <w:bCs w:val="0"/>
+        </w:rPr>
+        <w:t> :</w:t>
+      </w:r>
+    </w:p>
+    <w:p>
+      <w:pPr>
+        <w:pStyle w:val="DC4thbullet"/>
+      </w:pPr>
+      <w:r>
+        <w:t>{% for bullet</w:t>
+      </w:r>
+      <w:r>
+        <w:t>3</w:t>
+      </w:r>
+      <w:r>
+        <w:t xml:space="preserve"> in bullet</w:t>
+      </w:r>
+      <w:r>
+        <w:t>2</w:t>
+      </w:r>
+      <w:r>
+        <w:t>.description %}{{bullet</w:t>
+      </w:r>
+      <w:r>
+        <w:t>3</w:t>
+      </w:r>
+      <w:r>
+        <w:t>.title}}</w:t>
+      </w:r>
+      <w:r>
+        <w:t>{% if bullet3.description</w:t>
+      </w:r>
+      <w:r>
+        <w:t>%</w:t>
+      </w:r>
+      <w:r>
+        <w:t>}</w:t>
+      </w:r>
+      <w:r>
+        <w:t xml:space="preserve"> : </w:t>
+      </w:r>
+      <w:r>
+        <w:t>{{bullet3.description}}</w:t>
+      </w:r>
+      <w:r>
+        <w:t xml:space="preserve">{% </w:t>
+      </w:r>
+      <w:proofErr w:type="spellStart"/>
+      <w:r>
+        <w:t>endif</w:t>
+      </w:r>
+      <w:proofErr w:type="spellEnd"/>
+      <w:r>
+        <w:t xml:space="preserve"> %}</w:t>
+      </w:r>
+    </w:p>
+    <w:p>
+      <w:pPr>
+        <w:pStyle w:val="DC4thbullet"/>
+      </w:pPr>
+      <w:r>
+        <w:t xml:space="preserve">{% </w:t>
+      </w:r>
+      <w:proofErr w:type="spellStart"/>
+      <w:r>
+        <w:t>endfor</w:t>
+      </w:r>
+      <w:proofErr w:type="spellEnd"/>
+      <w:r>
+        <w:t xml:space="preserve"> %}</w:t>
+      </w:r>
+      <w:r>
+        <w:t xml:space="preserve">{% </w:t>
+      </w:r>
+      <w:proofErr w:type="spellStart"/>
+      <w:r>
+        <w:t>endif</w:t>
+      </w:r>
+      <w:proofErr w:type="spellEnd"/>
+      <w:r>
+        <w:t xml:space="preserve"> %}</w:t>
+      </w:r>
+    </w:p>
+    <w:p>
+      <w:pPr>
+        <w:pStyle w:val="DC3rdbullet"/>
+      </w:pPr>
+      <w:r>
+        <w:t xml:space="preserve">{% </w:t>
+      </w:r>
+      <w:proofErr w:type="spellStart"/>
+      <w:r>
+        <w:t>endfor</w:t>
+      </w:r>
+      <w:proofErr w:type="spellEnd"/>
+      <w:r>
+        <w:t xml:space="preserve"> %}</w:t>
+      </w:r>
+      <w:r>
+        <w:t xml:space="preserve">{% </w:t>
+      </w:r>
+      <w:proofErr w:type="spellStart"/>
+      <w:r>
+        <w:t>endif</w:t>
+      </w:r>
+      <w:proofErr w:type="spellEnd"/>
+      <w:r>
+        <w:t xml:space="preserve"> %}</w:t>
+      </w:r>
+    </w:p>
+    <w:p>
+      <w:pPr>
+        <w:pStyle w:val="DC2ndbullet"/>
+      </w:pPr>
+      <w:r>
+        <w:t xml:space="preserve">{% </w:t>
+      </w:r>
+      <w:proofErr w:type="spellStart"/>
+      <w:r>
+        <w:t>endfor</w:t>
+      </w:r>
+      <w:proofErr w:type="spellEnd"/>
+      <w:r>
+        <w:t xml:space="preserve"> %}</w:t>
+      </w:r>
+      <w:r>
+        <w:t xml:space="preserve">{% </w:t>
+      </w:r>
+      <w:proofErr w:type="spellStart"/>
+      <w:r>
+        <w:t>endif</w:t>
+      </w:r>
+      <w:proofErr w:type="spellEnd"/>
+      <w:r>
+        <w:t xml:space="preserve"> %}</w:t>
+      </w:r>
+      <w:r>
+        <w:t xml:space="preserve">{% </w:t>
+      </w:r>
+      <w:proofErr w:type="spellStart"/>
+      <w:r>
+        <w:t>endfor</w:t>
+      </w:r>
+      <w:proofErr w:type="spellEnd"/>
+      <w:r>
+        <w:t xml:space="preserve"> %}</w:t>
+      </w:r>
+    </w:p>
+    <w:p>
+      <w:pPr>
+        <w:pStyle w:val="DCNormal"/>
+      </w:pPr>
+      <w:r>
+        <w:t xml:space="preserve">{% </w:t>
+      </w:r>
+      <w:proofErr w:type="spellStart"/>
+      <w:r>
+        <w:t>endif</w:t>
+      </w:r>
+      <w:proofErr w:type="spellEnd"/>
+      <w:r>
+        <w:t xml:space="preserve"> %}</w:t>
+      </w:r>
+      <w:r>
+        <w:t xml:space="preserve">{% if </w:t>
+      </w:r>
+      <w:proofErr w:type="spellStart"/>
+      <w:r>
+        <w:t>main_skills.table</w:t>
       </w:r>
       <w:proofErr w:type="spellEnd"/>
       <w:r>
@@ -448,17 +770,11 @@
               <w:pStyle w:val="DCTableSkillsTitle"/>
             </w:pPr>
             <w:r>
-              <w:t xml:space="preserve">{% for </w:t>
-            </w:r>
-            <w:r>
-              <w:t xml:space="preserve">entry in </w:t>
+              <w:t xml:space="preserve">{% for entry in </w:t>
             </w:r>
             <w:proofErr w:type="spellStart"/>
             <w:r>
-              <w:t>main_skills.</w:t>
-            </w:r>
-            <w:r>
-              <w:t>table</w:t>
+              <w:t>main_skills.table</w:t>
             </w:r>
             <w:proofErr w:type="spellEnd"/>
             <w:r>
@@ -496,13 +812,7 @@
             </w:r>
             <w:proofErr w:type="spellStart"/>
             <w:r>
-              <w:t>entry</w:t>
-            </w:r>
-            <w:r>
-              <w:t>.</w:t>
-            </w:r>
-            <w:r>
-              <w:t>description</w:t>
+              <w:t>entry.description</w:t>
             </w:r>
             <w:proofErr w:type="spellEnd"/>
             <w:r>
@@ -574,360 +884,6 @@
         </w:tc>
       </w:tr>
     </w:tbl>
-    <w:p>
-      <w:pPr>
-        <w:pStyle w:val="DCNormal"/>
-      </w:pPr>
-      <w:r>
-        <w:t xml:space="preserve">{% </w:t>
-      </w:r>
-      <w:proofErr w:type="spellStart"/>
-      <w:r>
-        <w:t>endif</w:t>
-      </w:r>
-      <w:proofErr w:type="spellEnd"/>
-      <w:r>
-        <w:t xml:space="preserve"> %}</w:t>
-      </w:r>
-      <w:r>
-        <w:t xml:space="preserve">{% if </w:t>
-      </w:r>
-      <w:proofErr w:type="spellStart"/>
-      <w:r>
-        <w:t>main_skills</w:t>
-      </w:r>
-      <w:r>
-        <w:t>.</w:t>
-      </w:r>
-      <w:r>
-        <w:t>bullet</w:t>
-      </w:r>
-      <w:proofErr w:type="spellEnd"/>
-      <w:r>
-        <w:t xml:space="preserve"> %}</w:t>
-      </w:r>
-    </w:p>
-    <w:p>
-      <w:pPr>
-        <w:pStyle w:val="DCT1Sections"/>
-        <w:rPr>
-          <w:lang w:val="fr-FR"/>
-        </w:rPr>
-      </w:pPr>
-      <w:r>
-        <w:rPr>
-          <w:lang w:val="fr-FR"/>
-        </w:rPr>
-        <w:t>Domaines de comp</w:t>
-      </w:r>
-      <w:r>
-        <w:rPr>
-          <w:lang w:val="fr-FR"/>
-        </w:rPr>
-        <w:t>é</w:t>
-      </w:r>
-      <w:r>
-        <w:rPr>
-          <w:lang w:val="fr-FR"/>
-        </w:rPr>
-        <w:t>tences</w:t>
-      </w:r>
-    </w:p>
-    <w:p>
-      <w:pPr>
-        <w:pStyle w:val="DCNormal"/>
-      </w:pPr>
-      <w:r>
-        <w:t xml:space="preserve">{% for </w:t>
-      </w:r>
-      <w:r>
-        <w:t xml:space="preserve">entry in </w:t>
-      </w:r>
-      <w:proofErr w:type="spellStart"/>
-      <w:r>
-        <w:t>main_skills</w:t>
-      </w:r>
-      <w:r>
-        <w:t>.</w:t>
-      </w:r>
-      <w:r>
-        <w:t>bullet</w:t>
-      </w:r>
-      <w:proofErr w:type="spellEnd"/>
-      <w:r>
-        <w:t xml:space="preserve"> %}</w:t>
-      </w:r>
-    </w:p>
-    <w:p>
-      <w:pPr>
-        <w:pStyle w:val="DC1stbullet"/>
-      </w:pPr>
-      <w:r>
-        <w:t>{{</w:t>
-      </w:r>
-      <w:proofErr w:type="spellStart"/>
-      <w:r>
-        <w:t>entry.title</w:t>
-      </w:r>
-      <w:proofErr w:type="spellEnd"/>
-      <w:r>
-        <w:t>}}</w:t>
-      </w:r>
-      <w:r>
-        <w:t xml:space="preserve">{%if </w:t>
-      </w:r>
-      <w:proofErr w:type="spellStart"/>
-      <w:r>
-        <w:t>entry.description</w:t>
-      </w:r>
-      <w:proofErr w:type="spellEnd"/>
-      <w:r>
-        <w:t xml:space="preserve"> %}</w:t>
-      </w:r>
-    </w:p>
-    <w:p>
-      <w:pPr>
-        <w:pStyle w:val="DC2ndbullet"/>
-      </w:pPr>
-      <w:r>
-        <w:t>{</w:t>
-      </w:r>
-      <w:r>
-        <w:t xml:space="preserve">% </w:t>
-      </w:r>
-      <w:r>
-        <w:t>for bullet</w:t>
-      </w:r>
-      <w:r>
-        <w:t>1</w:t>
-      </w:r>
-      <w:r>
-        <w:t xml:space="preserve"> in</w:t>
-      </w:r>
-      <w:r>
-        <w:t xml:space="preserve"> </w:t>
-      </w:r>
-      <w:proofErr w:type="spellStart"/>
-      <w:r>
-        <w:t>entry.description</w:t>
-      </w:r>
-      <w:proofErr w:type="spellEnd"/>
-      <w:r>
-        <w:t xml:space="preserve"> %}{{bullet</w:t>
-      </w:r>
-      <w:r>
-        <w:t>1</w:t>
-      </w:r>
-      <w:r>
-        <w:t>.title</w:t>
-      </w:r>
-      <w:r>
-        <w:t>}}</w:t>
-      </w:r>
-      <w:r>
-        <w:t>{% if bullet</w:t>
-      </w:r>
-      <w:r>
-        <w:t>1</w:t>
-      </w:r>
-      <w:r>
-        <w:t>.de</w:t>
-      </w:r>
-      <w:r>
-        <w:t>s</w:t>
-      </w:r>
-      <w:r>
-        <w:t>cription</w:t>
-      </w:r>
-      <w:r>
-        <w:t xml:space="preserve"> %}</w:t>
-      </w:r>
-      <w:r>
-        <w:t> :</w:t>
-      </w:r>
-    </w:p>
-    <w:p>
-      <w:pPr>
-        <w:pStyle w:val="DC3rdbullet"/>
-        <w:rPr>
-          <w:bCs w:val="0"/>
-        </w:rPr>
-      </w:pPr>
-      <w:r>
-        <w:rPr>
-          <w:bCs w:val="0"/>
-        </w:rPr>
-        <w:t xml:space="preserve">{% for bullet2 </w:t>
-      </w:r>
-      <w:r>
-        <w:rPr>
-          <w:bCs w:val="0"/>
-        </w:rPr>
-        <w:t>in bullet1.description %}{{bullet2.title</w:t>
-      </w:r>
-      <w:r>
-        <w:rPr>
-          <w:bCs w:val="0"/>
-        </w:rPr>
-        <w:t>}}</w:t>
-      </w:r>
-      <w:r>
-        <w:rPr>
-          <w:bCs w:val="0"/>
-        </w:rPr>
-        <w:t>{% if bullet2.description %}</w:t>
-      </w:r>
-      <w:r>
-        <w:rPr>
-          <w:bCs w:val="0"/>
-        </w:rPr>
-        <w:t> :</w:t>
-      </w:r>
-    </w:p>
-    <w:p>
-      <w:pPr>
-        <w:pStyle w:val="DC4thbullet"/>
-      </w:pPr>
-      <w:r>
-        <w:t>{% for bullet</w:t>
-      </w:r>
-      <w:r>
-        <w:t>3</w:t>
-      </w:r>
-      <w:r>
-        <w:t xml:space="preserve"> in bullet</w:t>
-      </w:r>
-      <w:r>
-        <w:t>2</w:t>
-      </w:r>
-      <w:r>
-        <w:t>.description %}{{bullet</w:t>
-      </w:r>
-      <w:r>
-        <w:t>3</w:t>
-      </w:r>
-      <w:r>
-        <w:t>.title}}</w:t>
-      </w:r>
-      <w:r>
-        <w:t>{% if bullet3.description</w:t>
-      </w:r>
-      <w:r>
-        <w:t>%</w:t>
-      </w:r>
-      <w:r>
-        <w:t>}</w:t>
-      </w:r>
-      <w:r>
-        <w:t xml:space="preserve"> : </w:t>
-      </w:r>
-      <w:r>
-        <w:t>{{bullet3.description}}</w:t>
-      </w:r>
-      <w:r>
-        <w:t xml:space="preserve">{% </w:t>
-      </w:r>
-      <w:proofErr w:type="spellStart"/>
-      <w:r>
-        <w:t>endif</w:t>
-      </w:r>
-      <w:proofErr w:type="spellEnd"/>
-      <w:r>
-        <w:t xml:space="preserve"> %}</w:t>
-      </w:r>
-    </w:p>
-    <w:p>
-      <w:pPr>
-        <w:pStyle w:val="DC4thbullet"/>
-      </w:pPr>
-      <w:r>
-        <w:t xml:space="preserve">{% </w:t>
-      </w:r>
-      <w:proofErr w:type="spellStart"/>
-      <w:r>
-        <w:t>endfor</w:t>
-      </w:r>
-      <w:proofErr w:type="spellEnd"/>
-      <w:r>
-        <w:t xml:space="preserve"> %}</w:t>
-      </w:r>
-      <w:r>
-        <w:t xml:space="preserve">{% </w:t>
-      </w:r>
-      <w:proofErr w:type="spellStart"/>
-      <w:r>
-        <w:t>endif</w:t>
-      </w:r>
-      <w:proofErr w:type="spellEnd"/>
-      <w:r>
-        <w:t xml:space="preserve"> %}</w:t>
-      </w:r>
-    </w:p>
-    <w:p>
-      <w:pPr>
-        <w:pStyle w:val="DC3rdbullet"/>
-      </w:pPr>
-      <w:r>
-        <w:t xml:space="preserve">{% </w:t>
-      </w:r>
-      <w:proofErr w:type="spellStart"/>
-      <w:r>
-        <w:t>endfor</w:t>
-      </w:r>
-      <w:proofErr w:type="spellEnd"/>
-      <w:r>
-        <w:t xml:space="preserve"> %}</w:t>
-      </w:r>
-      <w:r>
-        <w:t xml:space="preserve">{% </w:t>
-      </w:r>
-      <w:proofErr w:type="spellStart"/>
-      <w:r>
-        <w:t>endif</w:t>
-      </w:r>
-      <w:proofErr w:type="spellEnd"/>
-      <w:r>
-        <w:t xml:space="preserve"> %}</w:t>
-      </w:r>
-    </w:p>
-    <w:p>
-      <w:pPr>
-        <w:pStyle w:val="DC2ndbullet"/>
-      </w:pPr>
-      <w:r>
-        <w:t xml:space="preserve">{% </w:t>
-      </w:r>
-      <w:proofErr w:type="spellStart"/>
-      <w:r>
-        <w:t>endfor</w:t>
-      </w:r>
-      <w:proofErr w:type="spellEnd"/>
-      <w:r>
-        <w:t xml:space="preserve"> %}</w:t>
-      </w:r>
-      <w:r>
-        <w:t xml:space="preserve">{% </w:t>
-      </w:r>
-      <w:proofErr w:type="spellStart"/>
-      <w:r>
-        <w:t>endif</w:t>
-      </w:r>
-      <w:proofErr w:type="spellEnd"/>
-      <w:r>
-        <w:t xml:space="preserve"> %}</w:t>
-      </w:r>
-      <w:r>
-        <w:t xml:space="preserve">{% </w:t>
-      </w:r>
-      <w:proofErr w:type="spellStart"/>
-      <w:r>
-        <w:t>endfor</w:t>
-      </w:r>
-      <w:proofErr w:type="spellEnd"/>
-      <w:r>
-        <w:t xml:space="preserve"> %}</w:t>
-      </w:r>
-    </w:p>
     <w:p>
       <w:pPr>
         <w:pStyle w:val="DCNormal"/>
@@ -1431,7 +1387,6 @@
         <w:pStyle w:val="DCNormal"/>
       </w:pPr>
       <w:r>
-        <w:lastRenderedPageBreak/>
         <w:t xml:space="preserve">{% for </w:t>
       </w:r>
       <w:r>
@@ -1476,6 +1431,7 @@
               <w:pStyle w:val="DCXPTitle"/>
             </w:pPr>
             <w:r>
+              <w:lastRenderedPageBreak/>
               <w:t>{{</w:t>
             </w:r>
             <w:proofErr w:type="spellStart"/>
@@ -1614,11 +1570,11 @@
         <w:t>}}</w:t>
       </w:r>
       <w:r>
-        <w:t>{% e</w:t>
+        <w:t xml:space="preserve">{% </w:t>
       </w:r>
       <w:proofErr w:type="spellStart"/>
       <w:r>
-        <w:t>ndif</w:t>
+        <w:t>endif</w:t>
       </w:r>
       <w:proofErr w:type="spellEnd"/>
       <w:r>

</xml_diff>

<commit_message>
nouveau template pour poste et skills cible
</commit_message>
<xml_diff>
--- a/templates_docx/template_jinja.docx
+++ b/templates_docx/template_jinja.docx
@@ -152,23 +152,183 @@
         <w:rPr>
           <w:lang w:val="fr-FR"/>
         </w:rPr>
-        <w:t>{{</w:t>
+        <w:t xml:space="preserve">{% set </w:t>
       </w:r>
       <w:proofErr w:type="spellStart"/>
-      <w:proofErr w:type="gramStart"/>
       <w:r>
         <w:rPr>
           <w:lang w:val="fr-FR"/>
         </w:rPr>
-        <w:t>header.poste</w:t>
+        <w:t>postes_actifs</w:t>
       </w:r>
       <w:proofErr w:type="spellEnd"/>
-      <w:proofErr w:type="gramEnd"/>
       <w:r>
         <w:rPr>
           <w:lang w:val="fr-FR"/>
         </w:rPr>
-        <w:t>}}</w:t>
+        <w:t xml:space="preserve"> = </w:t>
+      </w:r>
+      <w:proofErr w:type="spellStart"/>
+      <w:r>
+        <w:rPr>
+          <w:lang w:val="fr-FR"/>
+        </w:rPr>
+        <w:t>poste_cible</w:t>
+      </w:r>
+      <w:proofErr w:type="spellEnd"/>
+      <w:r>
+        <w:rPr>
+          <w:lang w:val="fr-FR"/>
+        </w:rPr>
+        <w:t xml:space="preserve"> | </w:t>
+      </w:r>
+      <w:proofErr w:type="spellStart"/>
+      <w:r>
+        <w:rPr>
+          <w:lang w:val="fr-FR"/>
+        </w:rPr>
+        <w:t>selectattr</w:t>
+      </w:r>
+      <w:proofErr w:type="spellEnd"/>
+      <w:r>
+        <w:rPr>
+          <w:lang w:val="fr-FR"/>
+        </w:rPr>
+        <w:t xml:space="preserve">("active") | </w:t>
+      </w:r>
+      <w:proofErr w:type="spellStart"/>
+      <w:r>
+        <w:rPr>
+          <w:lang w:val="fr-FR"/>
+        </w:rPr>
+        <w:t>list</w:t>
+      </w:r>
+      <w:proofErr w:type="spellEnd"/>
+      <w:r>
+        <w:rPr>
+          <w:lang w:val="fr-FR"/>
+        </w:rPr>
+        <w:t xml:space="preserve"> </w:t>
+      </w:r>
+      <w:proofErr w:type="gramStart"/>
+      <w:r>
+        <w:rPr>
+          <w:lang w:val="fr-FR"/>
+        </w:rPr>
+        <w:t>%}{</w:t>
+      </w:r>
+      <w:proofErr w:type="gramEnd"/>
+      <w:r>
+        <w:rPr>
+          <w:lang w:val="fr-FR"/>
+        </w:rPr>
+        <w:t xml:space="preserve">% if </w:t>
+      </w:r>
+      <w:proofErr w:type="spellStart"/>
+      <w:r>
+        <w:rPr>
+          <w:lang w:val="fr-FR"/>
+        </w:rPr>
+        <w:t>postes_actifs</w:t>
+      </w:r>
+      <w:proofErr w:type="spellEnd"/>
+      <w:r>
+        <w:rPr>
+          <w:lang w:val="fr-FR"/>
+        </w:rPr>
+        <w:t xml:space="preserve"> </w:t>
+      </w:r>
+      <w:proofErr w:type="gramStart"/>
+      <w:r>
+        <w:rPr>
+          <w:lang w:val="fr-FR"/>
+        </w:rPr>
+        <w:t xml:space="preserve">%}{{ </w:t>
+      </w:r>
+      <w:proofErr w:type="spellStart"/>
+      <w:r>
+        <w:rPr>
+          <w:lang w:val="fr-FR"/>
+        </w:rPr>
+        <w:t>postes</w:t>
+      </w:r>
+      <w:proofErr w:type="gramEnd"/>
+      <w:r>
+        <w:rPr>
+          <w:lang w:val="fr-FR"/>
+        </w:rPr>
+        <w:t>_</w:t>
+      </w:r>
+      <w:proofErr w:type="gramStart"/>
+      <w:r>
+        <w:rPr>
+          <w:lang w:val="fr-FR"/>
+        </w:rPr>
+        <w:t>actifs</w:t>
+      </w:r>
+      <w:proofErr w:type="spellEnd"/>
+      <w:r>
+        <w:rPr>
+          <w:lang w:val="fr-FR"/>
+        </w:rPr>
+        <w:t>[</w:t>
+      </w:r>
+      <w:proofErr w:type="gramEnd"/>
+      <w:r>
+        <w:rPr>
+          <w:lang w:val="fr-FR"/>
+        </w:rPr>
+        <w:t>0</w:t>
+      </w:r>
+      <w:proofErr w:type="gramStart"/>
+      <w:r>
+        <w:rPr>
+          <w:lang w:val="fr-FR"/>
+        </w:rPr>
+        <w:t>].</w:t>
+      </w:r>
+      <w:proofErr w:type="spellStart"/>
+      <w:r>
+        <w:rPr>
+          <w:lang w:val="fr-FR"/>
+        </w:rPr>
+        <w:t>title</w:t>
+      </w:r>
+      <w:proofErr w:type="spellEnd"/>
+      <w:proofErr w:type="gramEnd"/>
+      <w:r>
+        <w:rPr>
+          <w:lang w:val="fr-FR"/>
+        </w:rPr>
+        <w:t xml:space="preserve"> </w:t>
+      </w:r>
+      <w:proofErr w:type="gramStart"/>
+      <w:r>
+        <w:rPr>
+          <w:lang w:val="fr-FR"/>
+        </w:rPr>
+        <w:t>}}{</w:t>
+      </w:r>
+      <w:proofErr w:type="gramEnd"/>
+      <w:r>
+        <w:rPr>
+          <w:lang w:val="fr-FR"/>
+        </w:rPr>
+        <w:t xml:space="preserve">% </w:t>
+      </w:r>
+      <w:proofErr w:type="spellStart"/>
+      <w:r>
+        <w:rPr>
+          <w:lang w:val="fr-FR"/>
+        </w:rPr>
+        <w:t>endif</w:t>
+      </w:r>
+      <w:proofErr w:type="spellEnd"/>
+      <w:r>
+        <w:rPr>
+          <w:lang w:val="fr-FR"/>
+        </w:rPr>
+        <w:t xml:space="preserve"> %}</w:t>
       </w:r>
     </w:p>
     <w:p>
@@ -182,18 +342,58 @@
         <w:rPr>
           <w:lang w:val="fr-FR"/>
         </w:rPr>
-        <w:t xml:space="preserve">{% if </w:t>
+        <w:t xml:space="preserve">{% set </w:t>
       </w:r>
       <w:proofErr w:type="spellStart"/>
-      <w:proofErr w:type="gramStart"/>
       <w:r>
         <w:rPr>
           <w:lang w:val="fr-FR"/>
         </w:rPr>
-        <w:t>header.skills</w:t>
+        <w:t>skills_actifs</w:t>
       </w:r>
       <w:proofErr w:type="spellEnd"/>
-      <w:proofErr w:type="gramEnd"/>
+      <w:r>
+        <w:rPr>
+          <w:lang w:val="fr-FR"/>
+        </w:rPr>
+        <w:t xml:space="preserve"> = </w:t>
+      </w:r>
+      <w:proofErr w:type="spellStart"/>
+      <w:r>
+        <w:rPr>
+          <w:lang w:val="fr-FR"/>
+        </w:rPr>
+        <w:t>skills_cible</w:t>
+      </w:r>
+      <w:proofErr w:type="spellEnd"/>
+      <w:r>
+        <w:rPr>
+          <w:lang w:val="fr-FR"/>
+        </w:rPr>
+        <w:t xml:space="preserve"> | </w:t>
+      </w:r>
+      <w:proofErr w:type="spellStart"/>
+      <w:r>
+        <w:rPr>
+          <w:lang w:val="fr-FR"/>
+        </w:rPr>
+        <w:t>selectattr</w:t>
+      </w:r>
+      <w:proofErr w:type="spellEnd"/>
+      <w:r>
+        <w:rPr>
+          <w:lang w:val="fr-FR"/>
+        </w:rPr>
+        <w:t xml:space="preserve">("active") | </w:t>
+      </w:r>
+      <w:proofErr w:type="spellStart"/>
+      <w:r>
+        <w:rPr>
+          <w:lang w:val="fr-FR"/>
+        </w:rPr>
+        <w:t>list</w:t>
+      </w:r>
+      <w:proofErr w:type="spellEnd"/>
       <w:r>
         <w:rPr>
           <w:lang w:val="fr-FR"/>
@@ -212,13 +412,7 @@
         <w:rPr>
           <w:lang w:val="fr-FR"/>
         </w:rPr>
-        <w:t xml:space="preserve">% </w:t>
-      </w:r>
-      <w:r>
-        <w:rPr>
-          <w:lang w:val="fr-FR"/>
-        </w:rPr>
-        <w:t xml:space="preserve">for </w:t>
+        <w:t xml:space="preserve">% for </w:t>
       </w:r>
       <w:proofErr w:type="spellStart"/>
       <w:r>
@@ -235,15 +429,13 @@
         <w:t xml:space="preserve"> in </w:t>
       </w:r>
       <w:proofErr w:type="spellStart"/>
-      <w:proofErr w:type="gramStart"/>
       <w:r>
         <w:rPr>
           <w:lang w:val="fr-FR"/>
         </w:rPr>
-        <w:t>header.skills</w:t>
+        <w:t>skills_actifs</w:t>
       </w:r>
       <w:proofErr w:type="spellEnd"/>
-      <w:proofErr w:type="gramEnd"/>
       <w:r>
         <w:rPr>
           <w:lang w:val="fr-FR"/>
@@ -255,20 +447,7 @@
         <w:rPr>
           <w:lang w:val="fr-FR"/>
         </w:rPr>
-        <w:t>%}</w:t>
-      </w:r>
-      <w:r>
-        <w:rPr>
-          <w:lang w:val="fr-FR"/>
-        </w:rPr>
-        <w:t>{</w:t>
-      </w:r>
-      <w:proofErr w:type="gramEnd"/>
-      <w:r>
-        <w:rPr>
-          <w:lang w:val="fr-FR"/>
-        </w:rPr>
-        <w:t>{</w:t>
+        <w:t xml:space="preserve">%}{{ </w:t>
       </w:r>
       <w:proofErr w:type="spellStart"/>
       <w:r>
@@ -277,18 +456,77 @@
         </w:rPr>
         <w:t>skill</w:t>
       </w:r>
-      <w:proofErr w:type="spellEnd"/>
+      <w:proofErr w:type="gramEnd"/>
       <w:r>
         <w:rPr>
           <w:lang w:val="fr-FR"/>
         </w:rPr>
-        <w:t>}}</w:t>
-      </w:r>
+        <w:t>.</w:t>
+      </w:r>
+      <w:proofErr w:type="gramStart"/>
       <w:r>
         <w:rPr>
           <w:lang w:val="fr-FR"/>
         </w:rPr>
-        <w:t xml:space="preserve">, {% </w:t>
+        <w:t>title</w:t>
+      </w:r>
+      <w:proofErr w:type="spellEnd"/>
+      <w:r>
+        <w:rPr>
+          <w:lang w:val="fr-FR"/>
+        </w:rPr>
+        <w:t xml:space="preserve"> }}{</w:t>
+      </w:r>
+      <w:proofErr w:type="gramEnd"/>
+      <w:r>
+        <w:rPr>
+          <w:lang w:val="fr-FR"/>
+        </w:rPr>
+        <w:t xml:space="preserve">% if not </w:t>
+      </w:r>
+      <w:proofErr w:type="spellStart"/>
+      <w:proofErr w:type="gramStart"/>
+      <w:r>
+        <w:rPr>
+          <w:lang w:val="fr-FR"/>
+        </w:rPr>
+        <w:t>loop.last</w:t>
+      </w:r>
+      <w:proofErr w:type="spellEnd"/>
+      <w:proofErr w:type="gramEnd"/>
+      <w:r>
+        <w:rPr>
+          <w:lang w:val="fr-FR"/>
+        </w:rPr>
+        <w:t xml:space="preserve"> %}, {% </w:t>
+      </w:r>
+      <w:proofErr w:type="spellStart"/>
+      <w:r>
+        <w:rPr>
+          <w:lang w:val="fr-FR"/>
+        </w:rPr>
+        <w:t>endif</w:t>
+      </w:r>
+      <w:proofErr w:type="spellEnd"/>
+      <w:r>
+        <w:rPr>
+          <w:lang w:val="fr-FR"/>
+        </w:rPr>
+        <w:t xml:space="preserve"> </w:t>
+      </w:r>
+      <w:proofErr w:type="gramStart"/>
+      <w:r>
+        <w:rPr>
+          <w:lang w:val="fr-FR"/>
+        </w:rPr>
+        <w:t>%}{</w:t>
+      </w:r>
+      <w:proofErr w:type="gramEnd"/>
+      <w:r>
+        <w:rPr>
+          <w:lang w:val="fr-FR"/>
+        </w:rPr>
+        <w:t xml:space="preserve">% </w:t>
       </w:r>
       <w:proofErr w:type="spellStart"/>
       <w:r>
@@ -296,34 +534,6 @@
           <w:lang w:val="fr-FR"/>
         </w:rPr>
         <w:t>endfor</w:t>
-      </w:r>
-      <w:proofErr w:type="spellEnd"/>
-      <w:r>
-        <w:rPr>
-          <w:lang w:val="fr-FR"/>
-        </w:rPr>
-        <w:t xml:space="preserve"> </w:t>
-      </w:r>
-      <w:proofErr w:type="gramStart"/>
-      <w:r>
-        <w:rPr>
-          <w:lang w:val="fr-FR"/>
-        </w:rPr>
-        <w:t>%}{</w:t>
-      </w:r>
-      <w:proofErr w:type="gramEnd"/>
-      <w:r>
-        <w:rPr>
-          <w:lang w:val="fr-FR"/>
-        </w:rPr>
-        <w:t xml:space="preserve">% </w:t>
-      </w:r>
-      <w:proofErr w:type="spellStart"/>
-      <w:r>
-        <w:rPr>
-          <w:lang w:val="fr-FR"/>
-        </w:rPr>
-        <w:t>endif</w:t>
       </w:r>
       <w:proofErr w:type="spellEnd"/>
       <w:r>
@@ -1592,13 +1802,7 @@
         <w:pStyle w:val="DCNormal"/>
       </w:pPr>
       <w:r>
-        <w:t xml:space="preserve">{%p if </w:t>
-      </w:r>
-      <w:r>
-        <w:t>langue</w:t>
-      </w:r>
-      <w:r>
-        <w:t>s %}</w:t>
+        <w:t>{%p if langues %}</w:t>
       </w:r>
     </w:p>
     <w:p>
@@ -1644,13 +1848,7 @@
               <w:pStyle w:val="DCTableYear"/>
             </w:pPr>
             <w:r>
-              <w:t xml:space="preserve">{% for entry in </w:t>
-            </w:r>
-            <w:r>
-              <w:t>langues</w:t>
-            </w:r>
-            <w:r>
-              <w:t xml:space="preserve"> </w:t>
+              <w:t xml:space="preserve">{% for entry in langues </w:t>
             </w:r>
             <w:proofErr w:type="gramStart"/>
             <w:r>
@@ -1663,10 +1861,7 @@
             <w:proofErr w:type="spellStart"/>
             <w:proofErr w:type="gramStart"/>
             <w:r>
-              <w:t>entry.</w:t>
-            </w:r>
-            <w:r>
-              <w:t>title</w:t>
+              <w:t>entry.title</w:t>
             </w:r>
             <w:proofErr w:type="spellEnd"/>
             <w:proofErr w:type="gramEnd"/>
@@ -2399,87 +2594,69 @@
         </w:rPr>
         <w:t xml:space="preserve"> : </w:t>
       </w:r>
+      <w:proofErr w:type="gramStart"/>
       <w:r>
         <w:rPr>
-          <w:bCs/>
+          <w:b/>
         </w:rPr>
-        <w:t xml:space="preserve">{% for </w:t>
+        <w:t xml:space="preserve">{{ </w:t>
       </w:r>
       <w:proofErr w:type="spellStart"/>
       <w:r>
         <w:rPr>
-          <w:bCs/>
+          <w:b/>
         </w:rPr>
-        <w:t>tool</w:t>
+        <w:t>item.env</w:t>
+      </w:r>
+      <w:proofErr w:type="gramEnd"/>
+      <w:r>
+        <w:rPr>
+          <w:b/>
+        </w:rPr>
+        <w:t>_tech</w:t>
       </w:r>
       <w:proofErr w:type="spellEnd"/>
       <w:r>
         <w:rPr>
-          <w:bCs/>
+          <w:b/>
         </w:rPr>
-        <w:t xml:space="preserve"> in </w:t>
+        <w:t xml:space="preserve"> | </w:t>
       </w:r>
       <w:proofErr w:type="spellStart"/>
+      <w:proofErr w:type="gramStart"/>
       <w:r>
         <w:rPr>
-          <w:bCs/>
+          <w:b/>
         </w:rPr>
-        <w:t>item.env_tech</w:t>
+        <w:t>join</w:t>
       </w:r>
       <w:proofErr w:type="spellEnd"/>
       <w:r>
         <w:rPr>
-          <w:bCs/>
+          <w:b/>
         </w:rPr>
-        <w:t xml:space="preserve"> </w:t>
+        <w:t>(</w:t>
+      </w:r>
+      <w:proofErr w:type="gramEnd"/>
+      <w:r>
+        <w:rPr>
+          <w:b/>
+        </w:rPr>
+        <w:t>", "</w:t>
       </w:r>
       <w:proofErr w:type="gramStart"/>
       <w:r>
         <w:rPr>
-          <w:bCs/>
+          <w:b/>
         </w:rPr>
-        <w:t>%}</w:t>
-      </w:r>
+        <w:t>) }</w:t>
+      </w:r>
+      <w:proofErr w:type="gramEnd"/>
       <w:r>
         <w:rPr>
-          <w:bCs/>
+          <w:b/>
         </w:rPr>
-        <w:t>{</w:t>
-      </w:r>
-      <w:proofErr w:type="gramEnd"/>
-      <w:r>
-        <w:rPr>
-          <w:bCs/>
-        </w:rPr>
-        <w:t>{</w:t>
-      </w:r>
-      <w:proofErr w:type="spellStart"/>
-      <w:r>
-        <w:rPr>
-          <w:bCs/>
-        </w:rPr>
-        <w:t>tool</w:t>
-      </w:r>
-      <w:proofErr w:type="spellEnd"/>
-      <w:r>
-        <w:rPr>
-          <w:bCs/>
-        </w:rPr>
-        <w:t xml:space="preserve">}}, {% </w:t>
-      </w:r>
-      <w:proofErr w:type="spellStart"/>
-      <w:r>
-        <w:rPr>
-          <w:bCs/>
-        </w:rPr>
-        <w:t>endfor</w:t>
-      </w:r>
-      <w:proofErr w:type="spellEnd"/>
-      <w:r>
-        <w:rPr>
-          <w:bCs/>
-        </w:rPr>
-        <w:t xml:space="preserve"> %}</w:t>
+        <w:t>}</w:t>
       </w:r>
     </w:p>
     <w:p>

</xml_diff>

<commit_message>
test export docx + fix for poste et skills cible
</commit_message>
<xml_diff>
--- a/templates_docx/template_jinja.docx
+++ b/templates_docx/template_jinja.docx
@@ -1204,7 +1204,7 @@
             </w:r>
             <w:proofErr w:type="spellStart"/>
             <w:r>
-              <w:t>desc</w:t>
+              <w:t>title</w:t>
             </w:r>
             <w:proofErr w:type="spellEnd"/>
             <w:r>
@@ -1215,8 +1215,11 @@
             <w:r>
               <w:t>entry.description</w:t>
             </w:r>
+            <w:proofErr w:type="gramEnd"/>
+            <w:r>
+              <w:t>.title</w:t>
+            </w:r>
             <w:proofErr w:type="spellEnd"/>
-            <w:proofErr w:type="gramEnd"/>
             <w:r>
               <w:t xml:space="preserve"> </w:t>
             </w:r>
@@ -1230,7 +1233,7 @@
             </w:r>
             <w:proofErr w:type="spellStart"/>
             <w:r>
-              <w:t>desc</w:t>
+              <w:t>title</w:t>
             </w:r>
             <w:proofErr w:type="spellEnd"/>
             <w:r>

</xml_diff>